<commit_message>
fix(P4,P5): remove author block from blinded manuscripts (double-blind integrity)
The 6 P4/P5 blinded manuscripts (apbr/mbr/mir, apbr/cms/ijoem) carried a full
author block (names, emails, ORCID) — a desk-reject risk for anonymous review.
Replaced with '*Author details removed for blind review.*', matching the
convention already used in P3/P6/P7/P8/P9.
</commit_message>
<xml_diff>
--- a/p4/submission/apbr_package/01_manuscript_blinded.docx
+++ b/p4/submission/apbr_package/01_manuscript_blinded.docx
@@ -2,7 +2,7 @@
 <file path=word/document.xml><?xml version="1.0" encoding="utf-8"?>
 <w:document xmlns:w="http://schemas.openxmlformats.org/wordprocessingml/2006/main" xmlns:m="http://schemas.openxmlformats.org/officeDocument/2006/math" xmlns:r="http://schemas.openxmlformats.org/officeDocument/2006/relationships" xmlns:o="urn:schemas-microsoft-com:office:office" xmlns:v="urn:schemas-microsoft-com:vml" xmlns:w10="urn:schemas-microsoft-com:office:word" xmlns:a="http://schemas.openxmlformats.org/drawingml/2006/main" xmlns:pic="http://schemas.openxmlformats.org/drawingml/2006/picture" xmlns:wp="http://schemas.openxmlformats.org/drawingml/2006/wordprocessingDrawing">
   <w:body>
-    <w:bookmarkStart w:id="102" w:name="X07c3a2f9ec246b5120b9b19625fb58c0a5f9521"/>
+    <w:bookmarkStart w:id="98" w:name="X07c3a2f9ec246b5120b9b19625fb58c0a5f9521"/>
     <w:p>
       <w:pPr>
         <w:pStyle w:val="Heading1"/>
@@ -17,105 +17,11 @@
       </w:pPr>
       <w:r>
         <w:rPr>
-          <w:bCs/>
-          <w:b/>
-        </w:rPr>
-        <w:t xml:space="preserve">Do Thuy Huong</w:t>
-      </w:r>
-      <w:r>
-        <w:t xml:space="preserve"> </w:t>
-      </w:r>
-      <w:r>
-        <w:t xml:space="preserve">· College of Economics, Can Tho University ·</w:t>
-      </w:r>
-      <w:r>
-        <w:t xml:space="preserve"> </w:t>
-      </w:r>
-      <w:hyperlink r:id="rId20">
-        <w:r>
-          <w:rPr>
-            <w:rStyle w:val="Hyperlink"/>
-          </w:rPr>
-          <w:t xml:space="preserve">huongp1323001@gstudent.ctu.edu.vn</w:t>
-        </w:r>
-      </w:hyperlink>
-      <w:r>
-        <w:t xml:space="preserve"> </w:t>
-      </w:r>
-      <w:r>
-        <w:t xml:space="preserve">· ORCID:</w:t>
-      </w:r>
-      <w:r>
-        <w:t xml:space="preserve"> </w:t>
-      </w:r>
-      <w:hyperlink r:id="rId21">
-        <w:r>
-          <w:rPr>
-            <w:rStyle w:val="Hyperlink"/>
-          </w:rPr>
-          <w:t xml:space="preserve">0000-0002-7711-2487</w:t>
-        </w:r>
-      </w:hyperlink>
-      <w:r>
-        <w:br/>
-      </w:r>
-      <w:r>
-        <w:rPr>
-          <w:bCs/>
-          <w:b/>
-        </w:rPr>
-        <w:t xml:space="preserve">Phan Anh Tu</w:t>
-      </w:r>
-      <w:r>
-        <w:t xml:space="preserve"> </w:t>
-      </w:r>
-      <w:r>
-        <w:rPr>
           <w:iCs/>
           <w:i/>
         </w:rPr>
-        <w:t xml:space="preserve">(Corresponding author)</w:t>
-      </w:r>
-      <w:r>
-        <w:t xml:space="preserve"> </w:t>
-      </w:r>
-      <w:r>
-        <w:t xml:space="preserve">· College of Economics, Can Tho</w:t>
-      </w:r>
-      <w:r>
-        <w:t xml:space="preserve"> </w:t>
-      </w:r>
-      <w:r>
-        <w:t xml:space="preserve">University ·</w:t>
-      </w:r>
-      <w:r>
-        <w:t xml:space="preserve"> </w:t>
-      </w:r>
-      <w:hyperlink r:id="rId22">
-        <w:r>
-          <w:rPr>
-            <w:rStyle w:val="Hyperlink"/>
-          </w:rPr>
-          <w:t xml:space="preserve">patu@ctu.edu.vn</w:t>
-        </w:r>
-      </w:hyperlink>
-      <w:r>
-        <w:t xml:space="preserve"> </w:t>
-      </w:r>
-      <w:r>
-        <w:t xml:space="preserve">· ORCID:</w:t>
-      </w:r>
-      <w:r>
-        <w:t xml:space="preserve"> </w:t>
-      </w:r>
-      <w:hyperlink r:id="rId23">
-        <w:r>
-          <w:rPr>
-            <w:rStyle w:val="Hyperlink"/>
-          </w:rPr>
-          <w:t xml:space="preserve">0000-0003-0667-3137</w:t>
-        </w:r>
-      </w:hyperlink>
+        <w:t xml:space="preserve">Author details removed for blind review.</w:t>
+      </w:r>
     </w:p>
     <w:p>
       <w:pPr>
@@ -193,7 +99,7 @@
         <w:t xml:space="preserve">10</w:t>
       </w:r>
     </w:p>
-    <w:bookmarkStart w:id="24" w:name="abstract"/>
+    <w:bookmarkStart w:id="20" w:name="abstract"/>
     <w:p>
       <w:pPr>
         <w:pStyle w:val="Heading2"/>
@@ -356,8 +262,8 @@
         <w:t xml:space="preserve">productivity; Singapore</w:t>
       </w:r>
     </w:p>
-    <w:bookmarkEnd w:id="24"/>
-    <w:bookmarkStart w:id="29" w:name="Xe3d0fc0bea9a42ce7605565d0964033d7f6ee47"/>
+    <w:bookmarkEnd w:id="20"/>
+    <w:bookmarkStart w:id="25" w:name="Xe3d0fc0bea9a42ce7605565d0964033d7f6ee47"/>
     <w:p>
       <w:pPr>
         <w:pStyle w:val="Heading2"/>
@@ -366,7 +272,7 @@
         <w:t xml:space="preserve">1 Introduction</w:t>
       </w:r>
     </w:p>
-    <w:bookmarkStart w:id="25" w:name="Xe5b26b80b1cffd635bf6d81ca2944b40daaf62d"/>
+    <w:bookmarkStart w:id="21" w:name="Xe5b26b80b1cffd635bf6d81ca2944b40daaf62d"/>
     <w:p>
       <w:pPr>
         <w:pStyle w:val="Heading3"/>
@@ -786,8 +692,8 @@
         <w:t xml:space="preserve">2021).</w:t>
       </w:r>
     </w:p>
-    <w:bookmarkEnd w:id="25"/>
-    <w:bookmarkStart w:id="26" w:name="X2961a496af63dca26d6e29b654ead2e696c6fdd"/>
+    <w:bookmarkEnd w:id="21"/>
+    <w:bookmarkStart w:id="22" w:name="X2961a496af63dca26d6e29b654ead2e696c6fdd"/>
     <w:p>
       <w:pPr>
         <w:pStyle w:val="Heading3"/>
@@ -1002,8 +908,8 @@
         <w:t xml:space="preserve">framework.</w:t>
       </w:r>
     </w:p>
-    <w:bookmarkEnd w:id="26"/>
-    <w:bookmarkStart w:id="27" w:name="X494b14dde48fd709c427dcfac91526fdde5ec7e"/>
+    <w:bookmarkEnd w:id="22"/>
+    <w:bookmarkStart w:id="23" w:name="X494b14dde48fd709c427dcfac91526fdde5ec7e"/>
     <w:p>
       <w:pPr>
         <w:pStyle w:val="Heading3"/>
@@ -1254,8 +1160,8 @@
         <w:t xml:space="preserve">construct-boundary discussion).</w:t>
       </w:r>
     </w:p>
-    <w:bookmarkEnd w:id="27"/>
-    <w:bookmarkStart w:id="28" w:name="Xdd618d9602139b0eee88c4277e195c55d104c48"/>
+    <w:bookmarkEnd w:id="23"/>
+    <w:bookmarkStart w:id="24" w:name="Xdd618d9602139b0eee88c4277e195c55d104c48"/>
     <w:p>
       <w:pPr>
         <w:pStyle w:val="Heading3"/>
@@ -1296,9 +1202,9 @@
         <w:t xml:space="preserve">directions.</w:t>
       </w:r>
     </w:p>
-    <w:bookmarkEnd w:id="28"/>
-    <w:bookmarkEnd w:id="29"/>
-    <w:bookmarkStart w:id="38" w:name="X8bf20a63f0decf7b16e99d564b9958ec4fbbb23"/>
+    <w:bookmarkEnd w:id="24"/>
+    <w:bookmarkEnd w:id="25"/>
+    <w:bookmarkStart w:id="34" w:name="X8bf20a63f0decf7b16e99d564b9958ec4fbbb23"/>
     <w:p>
       <w:pPr>
         <w:pStyle w:val="Heading2"/>
@@ -1307,7 +1213,7 @@
         <w:t xml:space="preserve">2 Theory and Hypotheses</w:t>
       </w:r>
     </w:p>
-    <w:bookmarkStart w:id="30" w:name="X9497e0c582d29cdf214e76507e8fbbcc0b6d410"/>
+    <w:bookmarkStart w:id="26" w:name="X9497e0c582d29cdf214e76507e8fbbcc0b6d410"/>
     <w:p>
       <w:pPr>
         <w:pStyle w:val="Heading3"/>
@@ -1450,8 +1356,8 @@
         <w:t xml:space="preserve">operate in a digitally advanced institutional environment.</w:t>
       </w:r>
     </w:p>
-    <w:bookmarkEnd w:id="30"/>
-    <w:bookmarkStart w:id="31" w:name="X58009fa5124754b9d12ae223bf3908d651fea58"/>
+    <w:bookmarkEnd w:id="26"/>
+    <w:bookmarkStart w:id="27" w:name="X58009fa5124754b9d12ae223bf3908d651fea58"/>
     <w:p>
       <w:pPr>
         <w:pStyle w:val="Heading3"/>
@@ -1708,8 +1614,8 @@
         <w:t xml:space="preserve">nomological nets should remain analytically distinct.</w:t>
       </w:r>
     </w:p>
-    <w:bookmarkEnd w:id="31"/>
-    <w:bookmarkStart w:id="36" w:name="Xfeb3205642325e47f2817bab2cc060c9f999b02"/>
+    <w:bookmarkEnd w:id="27"/>
+    <w:bookmarkStart w:id="32" w:name="Xfeb3205642325e47f2817bab2cc060c9f999b02"/>
     <w:p>
       <w:pPr>
         <w:pStyle w:val="Heading3"/>
@@ -1718,7 +1624,7 @@
         <w:t xml:space="preserve">2.3 Hypothesis development</w:t>
       </w:r>
     </w:p>
-    <w:bookmarkStart w:id="32" w:name="X9de0e934912487c2b2355f424516474f67bf4ef"/>
+    <w:bookmarkStart w:id="28" w:name="X9de0e934912487c2b2355f424516474f67bf4ef"/>
     <w:p>
       <w:pPr>
         <w:pStyle w:val="Heading4"/>
@@ -1819,8 +1725,8 @@
         <w:t xml:space="preserve">is considered.</w:t>
       </w:r>
     </w:p>
-    <w:bookmarkEnd w:id="32"/>
-    <w:bookmarkStart w:id="33" w:name="Xd77aef7f084e33ec0dd33a50710ed9d88a5bd5f"/>
+    <w:bookmarkEnd w:id="28"/>
+    <w:bookmarkStart w:id="29" w:name="Xd77aef7f084e33ec0dd33a50710ed9d88a5bd5f"/>
     <w:p>
       <w:pPr>
         <w:pStyle w:val="Heading4"/>
@@ -1957,8 +1863,8 @@
         <w:t xml:space="preserve">export-intensity-contingent moderation of DAI on the I–P relationship.</w:t>
       </w:r>
     </w:p>
-    <w:bookmarkEnd w:id="33"/>
-    <w:bookmarkStart w:id="34" w:name="Xca797cdf899e8025c95598929e8214dfe008510"/>
+    <w:bookmarkEnd w:id="29"/>
+    <w:bookmarkStart w:id="30" w:name="Xca797cdf899e8025c95598929e8214dfe008510"/>
     <w:p>
       <w:pPr>
         <w:pStyle w:val="Heading4"/>
@@ -2071,8 +1977,8 @@
         <w:t xml:space="preserve">cross-border coordination demands generate measurable returns.</w:t>
       </w:r>
     </w:p>
-    <w:bookmarkEnd w:id="34"/>
-    <w:bookmarkStart w:id="35" w:name="Xb90d981e4efafb918608a9cc7d37012dec59e7b"/>
+    <w:bookmarkEnd w:id="30"/>
+    <w:bookmarkStart w:id="31" w:name="Xb90d981e4efafb918608a9cc7d37012dec59e7b"/>
     <w:p>
       <w:pPr>
         <w:pStyle w:val="Heading4"/>
@@ -2568,9 +2474,9 @@
         <w:t xml:space="preserve">systems.</w:t>
       </w:r>
     </w:p>
-    <w:bookmarkEnd w:id="35"/>
-    <w:bookmarkEnd w:id="36"/>
-    <w:bookmarkStart w:id="37" w:name="X120be97a373b91b5bab21d44e9895db7ca01e76"/>
+    <w:bookmarkEnd w:id="31"/>
+    <w:bookmarkEnd w:id="32"/>
+    <w:bookmarkStart w:id="33" w:name="X120be97a373b91b5bab21d44e9895db7ca01e76"/>
     <w:p>
       <w:pPr>
         <w:pStyle w:val="Heading3"/>
@@ -2871,9 +2777,9 @@
         <w:t xml:space="preserve">context: Singapore, Advanced I. Data: WBES 2023; N = 623.</w:t>
       </w:r>
     </w:p>
-    <w:bookmarkEnd w:id="37"/>
-    <w:bookmarkEnd w:id="38"/>
-    <w:bookmarkStart w:id="47" w:name="X167a2da0345881bf36eef0606d50b1063a572d3"/>
+    <w:bookmarkEnd w:id="33"/>
+    <w:bookmarkEnd w:id="34"/>
+    <w:bookmarkStart w:id="43" w:name="X167a2da0345881bf36eef0606d50b1063a572d3"/>
     <w:p>
       <w:pPr>
         <w:pStyle w:val="Heading2"/>
@@ -2882,7 +2788,7 @@
         <w:t xml:space="preserve">3 Methods</w:t>
       </w:r>
     </w:p>
-    <w:bookmarkStart w:id="39" w:name="X7539fb3dc2f98232f41138bc75cab658563f4ee"/>
+    <w:bookmarkStart w:id="35" w:name="X7539fb3dc2f98232f41138bc75cab658563f4ee"/>
     <w:p>
       <w:pPr>
         <w:pStyle w:val="Heading3"/>
@@ -3187,8 +3093,8 @@
         <w:t xml:space="preserve">region where the turning point is implied.</w:t>
       </w:r>
     </w:p>
-    <w:bookmarkEnd w:id="39"/>
-    <w:bookmarkStart w:id="44" w:name="Xbcf9f12e79107fa2c089aaf13fc6c4fb773f1c2"/>
+    <w:bookmarkEnd w:id="35"/>
+    <w:bookmarkStart w:id="40" w:name="Xbcf9f12e79107fa2c089aaf13fc6c4fb773f1c2"/>
     <w:p>
       <w:pPr>
         <w:pStyle w:val="Heading3"/>
@@ -3197,7 +3103,7 @@
         <w:t xml:space="preserve">3.2 Variables</w:t>
       </w:r>
     </w:p>
-    <w:bookmarkStart w:id="40" w:name="X7e58563e31c3ad002492190dd8d5308423faaad"/>
+    <w:bookmarkStart w:id="36" w:name="X7e58563e31c3ad002492190dd8d5308423faaad"/>
     <w:p>
       <w:pPr>
         <w:pStyle w:val="Heading4"/>
@@ -3262,8 +3168,8 @@
         <w:t xml:space="preserve">dependent variable is winsorized at the 1st and 99th percentiles.</w:t>
       </w:r>
     </w:p>
-    <w:bookmarkEnd w:id="40"/>
-    <w:bookmarkStart w:id="41" w:name="X2cdc78afcfd9a4441a0b7b899a2b559f49a455a"/>
+    <w:bookmarkEnd w:id="36"/>
+    <w:bookmarkStart w:id="37" w:name="X2cdc78afcfd9a4441a0b7b899a2b559f49a455a"/>
     <w:p>
       <w:pPr>
         <w:pStyle w:val="Heading4"/>
@@ -3316,8 +3222,8 @@
         <w:t xml:space="preserve">concern (O’Brien 2007).</w:t>
       </w:r>
     </w:p>
-    <w:bookmarkEnd w:id="41"/>
-    <w:bookmarkStart w:id="42" w:name="X5885cfa65cddf1d15b27f59176f9dbae5a8c10a"/>
+    <w:bookmarkEnd w:id="37"/>
+    <w:bookmarkStart w:id="38" w:name="X5885cfa65cddf1d15b27f59176f9dbae5a8c10a"/>
     <w:p>
       <w:pPr>
         <w:pStyle w:val="Heading4"/>
@@ -3598,8 +3504,8 @@
         <w:t xml:space="preserve">supporting contribution on construct-tier specificity.</w:t>
       </w:r>
     </w:p>
-    <w:bookmarkEnd w:id="42"/>
-    <w:bookmarkStart w:id="43" w:name="X7f318314f3a5164dbb5d2e2bfe8bd11c34b488e"/>
+    <w:bookmarkEnd w:id="38"/>
+    <w:bookmarkStart w:id="39" w:name="X7f318314f3a5164dbb5d2e2bfe8bd11c34b488e"/>
     <w:p>
       <w:pPr>
         <w:pStyle w:val="Heading4"/>
@@ -3676,9 +3582,9 @@
         <w:t xml:space="preserve">diagnostics indicated problematic collinearity with firm size.</w:t>
       </w:r>
     </w:p>
-    <w:bookmarkEnd w:id="43"/>
-    <w:bookmarkEnd w:id="44"/>
-    <w:bookmarkStart w:id="45" w:name="X84482d10811f20e2a246857c008316fafc15eb6"/>
+    <w:bookmarkEnd w:id="39"/>
+    <w:bookmarkEnd w:id="40"/>
+    <w:bookmarkStart w:id="41" w:name="X84482d10811f20e2a246857c008316fafc15eb6"/>
     <w:p>
       <w:pPr>
         <w:pStyle w:val="Heading3"/>
@@ -4011,8 +3917,8 @@
         <w:t xml:space="preserve">associations rather than causal effects.</w:t>
       </w:r>
     </w:p>
-    <w:bookmarkEnd w:id="45"/>
-    <w:bookmarkStart w:id="46" w:name="X4758c326240d97a48e7d79456dba8f6cc5c46be"/>
+    <w:bookmarkEnd w:id="41"/>
+    <w:bookmarkStart w:id="42" w:name="X4758c326240d97a48e7d79456dba8f6cc5c46be"/>
     <w:p>
       <w:pPr>
         <w:pStyle w:val="Heading3"/>
@@ -4703,9 +4609,9 @@
         <w:t xml:space="preserve">conditions.</w:t>
       </w:r>
     </w:p>
-    <w:bookmarkEnd w:id="46"/>
-    <w:bookmarkEnd w:id="47"/>
-    <w:bookmarkStart w:id="53" w:name="X121719332867ee227f0a04b486098cee978c6e6"/>
+    <w:bookmarkEnd w:id="42"/>
+    <w:bookmarkEnd w:id="43"/>
+    <w:bookmarkStart w:id="49" w:name="X121719332867ee227f0a04b486098cee978c6e6"/>
     <w:p>
       <w:pPr>
         <w:pStyle w:val="Heading2"/>
@@ -4714,7 +4620,7 @@
         <w:t xml:space="preserve">4 Results</w:t>
       </w:r>
     </w:p>
-    <w:bookmarkStart w:id="48" w:name="Xcfcbc1028680fbd618b9b585dd17cf608861803"/>
+    <w:bookmarkStart w:id="44" w:name="Xcfcbc1028680fbd618b9b585dd17cf608861803"/>
     <w:p>
       <w:pPr>
         <w:pStyle w:val="Heading3"/>
@@ -5097,8 +5003,8 @@
         <w:t xml:space="preserve">.05, p &lt; .01.</w:t>
       </w:r>
     </w:p>
-    <w:bookmarkEnd w:id="48"/>
-    <w:bookmarkStart w:id="49" w:name="Xe86cbbe4620ce5d84f78b7737e30408048ed6af"/>
+    <w:bookmarkEnd w:id="44"/>
+    <w:bookmarkStart w:id="45" w:name="Xe86cbbe4620ce5d84f78b7737e30408048ed6af"/>
     <w:p>
       <w:pPr>
         <w:pStyle w:val="Heading3"/>
@@ -5350,8 +5256,8 @@
         <w:t xml:space="preserve">support actually available in the Singapore sample.</w:t>
       </w:r>
     </w:p>
-    <w:bookmarkEnd w:id="49"/>
-    <w:bookmarkStart w:id="50" w:name="Xbd081e7d38ad07e1e46d233e5fbc3c3c47a4f64"/>
+    <w:bookmarkEnd w:id="45"/>
+    <w:bookmarkStart w:id="46" w:name="Xbd081e7d38ad07e1e46d233e5fbc3c3c47a4f64"/>
     <w:p>
       <w:pPr>
         <w:pStyle w:val="Heading3"/>
@@ -5482,8 +5388,8 @@
         <w:t xml:space="preserve">digital complementarity.</w:t>
       </w:r>
     </w:p>
-    <w:bookmarkEnd w:id="50"/>
-    <w:bookmarkStart w:id="51" w:name="X0bc604979a3b7f5f87ce430a2a9c0e71ddd76f9"/>
+    <w:bookmarkEnd w:id="46"/>
+    <w:bookmarkStart w:id="47" w:name="X0bc604979a3b7f5f87ce430a2a9c0e71ddd76f9"/>
     <w:p>
       <w:pPr>
         <w:pStyle w:val="Heading3"/>
@@ -8681,8 +8587,8 @@
         <w:t xml:space="preserve">identified evidence of an inverted-U.</w:t>
       </w:r>
     </w:p>
-    <w:bookmarkEnd w:id="51"/>
-    <w:bookmarkStart w:id="52" w:name="Xc8e997e14555d7ba8da5c1d596c5311617447cd"/>
+    <w:bookmarkEnd w:id="47"/>
+    <w:bookmarkStart w:id="48" w:name="Xc8e997e14555d7ba8da5c1d596c5311617447cd"/>
     <w:p>
       <w:pPr>
         <w:pStyle w:val="Heading3"/>
@@ -9778,9 +9684,9 @@
         <w:t xml:space="preserve">construct.</w:t>
       </w:r>
     </w:p>
-    <w:bookmarkEnd w:id="52"/>
-    <w:bookmarkEnd w:id="53"/>
-    <w:bookmarkStart w:id="56" w:name="X735612638e4e736e4693e459c258977262c0dfc"/>
+    <w:bookmarkEnd w:id="48"/>
+    <w:bookmarkEnd w:id="49"/>
+    <w:bookmarkStart w:id="52" w:name="X735612638e4e736e4693e459c258977262c0dfc"/>
     <w:p>
       <w:pPr>
         <w:pStyle w:val="Heading2"/>
@@ -9789,7 +9695,7 @@
         <w:t xml:space="preserve">5 Discussion</w:t>
       </w:r>
     </w:p>
-    <w:bookmarkStart w:id="54" w:name="X027b31c2d090a00917aa7291770680fd40b64cd"/>
+    <w:bookmarkStart w:id="50" w:name="X027b31c2d090a00917aa7291770680fd40b64cd"/>
     <w:p>
       <w:pPr>
         <w:pStyle w:val="Heading3"/>
@@ -10836,8 +10742,8 @@
         <w:t xml:space="preserve">indicator of where Tier-2 adoption leads.</w:t>
       </w:r>
     </w:p>
-    <w:bookmarkEnd w:id="54"/>
-    <w:bookmarkStart w:id="55" w:name="Xa4e692b259d9b803bab54ad026a7e8d888a5d2c"/>
+    <w:bookmarkEnd w:id="50"/>
+    <w:bookmarkStart w:id="51" w:name="Xa4e692b259d9b803bab54ad026a7e8d888a5d2c"/>
     <w:p>
       <w:pPr>
         <w:pStyle w:val="Heading3"/>
@@ -11040,9 +10946,9 @@
         <w:t xml:space="preserve">undifferentiated digital-capability agenda.</w:t>
       </w:r>
     </w:p>
-    <w:bookmarkEnd w:id="55"/>
-    <w:bookmarkEnd w:id="56"/>
-    <w:bookmarkStart w:id="57" w:name="X6b297cc947e0db5526be369b1f0f4ddc67b2415"/>
+    <w:bookmarkEnd w:id="51"/>
+    <w:bookmarkEnd w:id="52"/>
+    <w:bookmarkStart w:id="53" w:name="X6b297cc947e0db5526be369b1f0f4ddc67b2415"/>
     <w:p>
       <w:pPr>
         <w:pStyle w:val="Heading2"/>
@@ -11257,8 +11163,8 @@
         <w:t xml:space="preserve">be sustained.</w:t>
       </w:r>
     </w:p>
-    <w:bookmarkEnd w:id="57"/>
-    <w:bookmarkStart w:id="58" w:name="X422fdd10c3908fe492ea939b97371c73422dbba"/>
+    <w:bookmarkEnd w:id="53"/>
+    <w:bookmarkStart w:id="54" w:name="X422fdd10c3908fe492ea939b97371c73422dbba"/>
     <w:p>
       <w:pPr>
         <w:pStyle w:val="Heading2"/>
@@ -11557,8 +11463,8 @@
         <w:t xml:space="preserve">deliver clean causal identification.</w:t>
       </w:r>
     </w:p>
-    <w:bookmarkEnd w:id="58"/>
-    <w:bookmarkStart w:id="60" w:name="data-availability-statement"/>
+    <w:bookmarkEnd w:id="54"/>
+    <w:bookmarkStart w:id="56" w:name="data-availability-statement"/>
     <w:p>
       <w:pPr>
         <w:pStyle w:val="Heading2"/>
@@ -11583,8 +11489,8 @@
       <w:r>
         <w:t xml:space="preserve"> </w:t>
       </w:r>
-      <w:hyperlink r:id="rId59">
-        <w:hyperlink r:id="rId59">
+      <w:hyperlink r:id="rId55">
+        <w:hyperlink r:id="rId55">
           <w:r>
             <w:rPr>
               <w:rStyle w:val="Hyperlink"/>
@@ -11609,8 +11515,8 @@
         <w:t xml:space="preserve">author on reasonable request.</w:t>
       </w:r>
     </w:p>
-    <w:bookmarkEnd w:id="60"/>
-    <w:bookmarkStart w:id="61" w:name="acknowledgements"/>
+    <w:bookmarkEnd w:id="56"/>
+    <w:bookmarkStart w:id="57" w:name="acknowledgements"/>
     <w:p>
       <w:pPr>
         <w:pStyle w:val="Heading2"/>
@@ -11633,8 +11539,8 @@
         <w:t xml:space="preserve">Global Indicators Group of the World Bank for the data.</w:t>
       </w:r>
     </w:p>
-    <w:bookmarkEnd w:id="61"/>
-    <w:bookmarkStart w:id="62" w:name="funding"/>
+    <w:bookmarkEnd w:id="57"/>
+    <w:bookmarkStart w:id="58" w:name="funding"/>
     <w:p>
       <w:pPr>
         <w:pStyle w:val="Heading2"/>
@@ -11651,8 +11557,8 @@
         <w:t xml:space="preserve">This research received no external funding.</w:t>
       </w:r>
     </w:p>
-    <w:bookmarkEnd w:id="62"/>
-    <w:bookmarkStart w:id="63" w:name="conflict-of-interest"/>
+    <w:bookmarkEnd w:id="58"/>
+    <w:bookmarkStart w:id="59" w:name="conflict-of-interest"/>
     <w:p>
       <w:pPr>
         <w:pStyle w:val="Heading2"/>
@@ -11669,8 +11575,8 @@
         <w:t xml:space="preserve">The authors declare no conflicts of interest.</w:t>
       </w:r>
     </w:p>
-    <w:bookmarkEnd w:id="63"/>
-    <w:bookmarkStart w:id="65" w:name="ai-and-data-availability"/>
+    <w:bookmarkEnd w:id="59"/>
+    <w:bookmarkStart w:id="61" w:name="ai-and-data-availability"/>
     <w:p>
       <w:pPr>
         <w:pStyle w:val="Heading2"/>
@@ -11735,7 +11641,7 @@
       <w:r>
         <w:t xml:space="preserve"> </w:t>
       </w:r>
-      <w:hyperlink r:id="rId64">
+      <w:hyperlink r:id="rId60">
         <w:r>
           <w:rPr>
             <w:rStyle w:val="Hyperlink"/>
@@ -11759,8 +11665,8 @@
         <w:t xml:space="preserve">upon reasonable request.</w:t>
       </w:r>
     </w:p>
-    <w:bookmarkEnd w:id="65"/>
-    <w:bookmarkStart w:id="101" w:name="references"/>
+    <w:bookmarkEnd w:id="61"/>
+    <w:bookmarkStart w:id="97" w:name="references"/>
     <w:p>
       <w:pPr>
         <w:pStyle w:val="Heading2"/>
@@ -11818,7 +11724,7 @@
       <w:r>
         <w:t xml:space="preserve"> </w:t>
       </w:r>
-      <w:hyperlink r:id="rId66">
+      <w:hyperlink r:id="rId62">
         <w:r>
           <w:rPr>
             <w:rStyle w:val="Hyperlink"/>
@@ -11887,7 +11793,7 @@
       <w:r>
         <w:t xml:space="preserve"> </w:t>
       </w:r>
-      <w:hyperlink r:id="rId67">
+      <w:hyperlink r:id="rId63">
         <w:r>
           <w:rPr>
             <w:rStyle w:val="Hyperlink"/>
@@ -11943,7 +11849,7 @@
       <w:r>
         <w:t xml:space="preserve"> </w:t>
       </w:r>
-      <w:hyperlink r:id="rId68">
+      <w:hyperlink r:id="rId64">
         <w:r>
           <w:rPr>
             <w:rStyle w:val="Hyperlink"/>
@@ -11979,7 +11885,7 @@
       <w:r>
         <w:t xml:space="preserve"> </w:t>
       </w:r>
-      <w:hyperlink r:id="rId69">
+      <w:hyperlink r:id="rId65">
         <w:r>
           <w:rPr>
             <w:rStyle w:val="Hyperlink"/>
@@ -12029,7 +11935,7 @@
       <w:r>
         <w:t xml:space="preserve"> </w:t>
       </w:r>
-      <w:hyperlink r:id="rId70">
+      <w:hyperlink r:id="rId66">
         <w:r>
           <w:rPr>
             <w:rStyle w:val="Hyperlink"/>
@@ -12085,7 +11991,7 @@
       <w:r>
         <w:t xml:space="preserve"> </w:t>
       </w:r>
-      <w:hyperlink r:id="rId71">
+      <w:hyperlink r:id="rId67">
         <w:r>
           <w:rPr>
             <w:rStyle w:val="Hyperlink"/>
@@ -12121,7 +12027,7 @@
       <w:r>
         <w:t xml:space="preserve"> </w:t>
       </w:r>
-      <w:hyperlink r:id="rId72">
+      <w:hyperlink r:id="rId68">
         <w:r>
           <w:rPr>
             <w:rStyle w:val="Hyperlink"/>
@@ -12207,7 +12113,7 @@
       <w:r>
         <w:t xml:space="preserve"> </w:t>
       </w:r>
-      <w:hyperlink r:id="rId73">
+      <w:hyperlink r:id="rId69">
         <w:r>
           <w:rPr>
             <w:rStyle w:val="Hyperlink"/>
@@ -12255,7 +12161,7 @@
       <w:r>
         <w:t xml:space="preserve"> </w:t>
       </w:r>
-      <w:hyperlink r:id="rId74">
+      <w:hyperlink r:id="rId70">
         <w:r>
           <w:rPr>
             <w:rStyle w:val="Hyperlink"/>
@@ -12303,7 +12209,7 @@
       <w:r>
         <w:t xml:space="preserve"> </w:t>
       </w:r>
-      <w:hyperlink r:id="rId75">
+      <w:hyperlink r:id="rId71">
         <w:r>
           <w:rPr>
             <w:rStyle w:val="Hyperlink"/>
@@ -12357,7 +12263,7 @@
       <w:r>
         <w:t xml:space="preserve"> </w:t>
       </w:r>
-      <w:hyperlink r:id="rId76">
+      <w:hyperlink r:id="rId72">
         <w:r>
           <w:rPr>
             <w:rStyle w:val="Hyperlink"/>
@@ -12399,7 +12305,7 @@
       <w:r>
         <w:t xml:space="preserve"> </w:t>
       </w:r>
-      <w:hyperlink r:id="rId77">
+      <w:hyperlink r:id="rId73">
         <w:r>
           <w:rPr>
             <w:rStyle w:val="Hyperlink"/>
@@ -12441,7 +12347,7 @@
       <w:r>
         <w:t xml:space="preserve"> </w:t>
       </w:r>
-      <w:hyperlink r:id="rId78">
+      <w:hyperlink r:id="rId74">
         <w:r>
           <w:rPr>
             <w:rStyle w:val="Hyperlink"/>
@@ -12497,7 +12403,7 @@
       <w:r>
         <w:t xml:space="preserve"> </w:t>
       </w:r>
-      <w:hyperlink r:id="rId79">
+      <w:hyperlink r:id="rId75">
         <w:r>
           <w:rPr>
             <w:rStyle w:val="Hyperlink"/>
@@ -12547,7 +12453,7 @@
       <w:r>
         <w:t xml:space="preserve"> </w:t>
       </w:r>
-      <w:hyperlink r:id="rId80">
+      <w:hyperlink r:id="rId76">
         <w:r>
           <w:rPr>
             <w:rStyle w:val="Hyperlink"/>
@@ -12603,7 +12509,7 @@
       <w:r>
         <w:t xml:space="preserve"> </w:t>
       </w:r>
-      <w:hyperlink r:id="rId81">
+      <w:hyperlink r:id="rId77">
         <w:r>
           <w:rPr>
             <w:rStyle w:val="Hyperlink"/>
@@ -12653,7 +12559,7 @@
       <w:r>
         <w:t xml:space="preserve"> </w:t>
       </w:r>
-      <w:hyperlink r:id="rId82">
+      <w:hyperlink r:id="rId78">
         <w:r>
           <w:rPr>
             <w:rStyle w:val="Hyperlink"/>
@@ -12709,7 +12615,7 @@
       <w:r>
         <w:t xml:space="preserve"> </w:t>
       </w:r>
-      <w:hyperlink r:id="rId83">
+      <w:hyperlink r:id="rId79">
         <w:r>
           <w:rPr>
             <w:rStyle w:val="Hyperlink"/>
@@ -12765,7 +12671,7 @@
       <w:r>
         <w:t xml:space="preserve"> </w:t>
       </w:r>
-      <w:hyperlink r:id="rId84">
+      <w:hyperlink r:id="rId80">
         <w:r>
           <w:rPr>
             <w:rStyle w:val="Hyperlink"/>
@@ -12821,7 +12727,7 @@
       <w:r>
         <w:t xml:space="preserve"> </w:t>
       </w:r>
-      <w:hyperlink r:id="rId85">
+      <w:hyperlink r:id="rId81">
         <w:r>
           <w:rPr>
             <w:rStyle w:val="Hyperlink"/>
@@ -12869,7 +12775,7 @@
       <w:r>
         <w:t xml:space="preserve"> </w:t>
       </w:r>
-      <w:hyperlink r:id="rId86">
+      <w:hyperlink r:id="rId82">
         <w:r>
           <w:rPr>
             <w:rStyle w:val="Hyperlink"/>
@@ -12911,7 +12817,7 @@
       <w:r>
         <w:t xml:space="preserve"> </w:t>
       </w:r>
-      <w:hyperlink r:id="rId87">
+      <w:hyperlink r:id="rId83">
         <w:r>
           <w:rPr>
             <w:rStyle w:val="Hyperlink"/>
@@ -12947,7 +12853,7 @@
       <w:r>
         <w:t xml:space="preserve"> </w:t>
       </w:r>
-      <w:hyperlink r:id="rId88">
+      <w:hyperlink r:id="rId84">
         <w:r>
           <w:rPr>
             <w:rStyle w:val="Hyperlink"/>
@@ -12997,7 +12903,7 @@
       <w:r>
         <w:t xml:space="preserve"> </w:t>
       </w:r>
-      <w:hyperlink r:id="rId89">
+      <w:hyperlink r:id="rId85">
         <w:r>
           <w:rPr>
             <w:rStyle w:val="Hyperlink"/>
@@ -13033,7 +12939,7 @@
       <w:r>
         <w:t xml:space="preserve"> </w:t>
       </w:r>
-      <w:hyperlink r:id="rId90">
+      <w:hyperlink r:id="rId86">
         <w:r>
           <w:rPr>
             <w:rStyle w:val="Hyperlink"/>
@@ -13089,7 +12995,7 @@
       <w:r>
         <w:t xml:space="preserve"> </w:t>
       </w:r>
-      <w:hyperlink r:id="rId91">
+      <w:hyperlink r:id="rId87">
         <w:r>
           <w:rPr>
             <w:rStyle w:val="Hyperlink"/>
@@ -13145,7 +13051,7 @@
       <w:r>
         <w:t xml:space="preserve"> </w:t>
       </w:r>
-      <w:hyperlink r:id="rId92">
+      <w:hyperlink r:id="rId88">
         <w:r>
           <w:rPr>
             <w:rStyle w:val="Hyperlink"/>
@@ -13201,7 +13107,7 @@
       <w:r>
         <w:t xml:space="preserve"> </w:t>
       </w:r>
-      <w:hyperlink r:id="rId93">
+      <w:hyperlink r:id="rId89">
         <w:r>
           <w:rPr>
             <w:rStyle w:val="Hyperlink"/>
@@ -13255,7 +13161,7 @@
       <w:r>
         <w:t xml:space="preserve"> </w:t>
       </w:r>
-      <w:hyperlink r:id="rId94">
+      <w:hyperlink r:id="rId90">
         <w:r>
           <w:rPr>
             <w:rStyle w:val="Hyperlink"/>
@@ -13297,7 +13203,7 @@
       <w:r>
         <w:t xml:space="preserve"> </w:t>
       </w:r>
-      <w:hyperlink r:id="rId95">
+      <w:hyperlink r:id="rId91">
         <w:r>
           <w:rPr>
             <w:rStyle w:val="Hyperlink"/>
@@ -13364,7 +13270,7 @@
       <w:r>
         <w:t xml:space="preserve"> </w:t>
       </w:r>
-      <w:hyperlink r:id="rId96">
+      <w:hyperlink r:id="rId92">
         <w:r>
           <w:rPr>
             <w:rStyle w:val="Hyperlink"/>
@@ -13402,7 +13308,7 @@
       <w:r>
         <w:t xml:space="preserve"> </w:t>
       </w:r>
-      <w:hyperlink r:id="rId97">
+      <w:hyperlink r:id="rId93">
         <w:r>
           <w:rPr>
             <w:rStyle w:val="Hyperlink"/>
@@ -13443,7 +13349,7 @@
       <w:r>
         <w:t xml:space="preserve"> </w:t>
       </w:r>
-      <w:hyperlink r:id="rId98">
+      <w:hyperlink r:id="rId94">
         <w:r>
           <w:rPr>
             <w:rStyle w:val="Hyperlink"/>
@@ -13481,7 +13387,7 @@
       <w:r>
         <w:t xml:space="preserve"> </w:t>
       </w:r>
-      <w:hyperlink r:id="rId99">
+      <w:hyperlink r:id="rId95">
         <w:r>
           <w:rPr>
             <w:rStyle w:val="Hyperlink"/>
@@ -13519,7 +13425,7 @@
       <w:r>
         <w:t xml:space="preserve"> </w:t>
       </w:r>
-      <w:hyperlink r:id="rId100">
+      <w:hyperlink r:id="rId96">
         <w:r>
           <w:rPr>
             <w:rStyle w:val="Hyperlink"/>
@@ -13549,7 +13455,7 @@
       <w:r>
         <w:t xml:space="preserve"> </w:t>
       </w:r>
-      <w:hyperlink r:id="rId64">
+      <w:hyperlink r:id="rId60">
         <w:r>
           <w:rPr>
             <w:rStyle w:val="Hyperlink"/>
@@ -13558,8 +13464,8 @@
         </w:r>
       </w:hyperlink>
     </w:p>
-    <w:bookmarkEnd w:id="101"/>
-    <w:bookmarkEnd w:id="102"/>
+    <w:bookmarkEnd w:id="97"/>
+    <w:bookmarkEnd w:id="98"/>
     <w:sectPr/>
   </w:body>
 </w:document>

</xml_diff>

<commit_message>
polish(P4-P9): remove draft-status artifacts; fix P6 jwb journal; spaced-thousands all packages
- Remove draft headers from blinded MS: P7 'Version/Status' lines (3 pkgs);
  P9 line-477 draft footer (3 MS + source).
- P6 jwb package named wrong journal (IBR) -> Journal of World Business (JWB).
- Spaced thousands 'N, NNN'->'N,NNN' across all secondary packages (180 fixes).
- Rebuilt all affected docx.
</commit_message>
<xml_diff>
--- a/p4/submission/apbr_package/01_manuscript_blinded.docx
+++ b/p4/submission/apbr_package/01_manuscript_blinded.docx
@@ -62,7 +62,7 @@
         <w:t xml:space="preserve"> </w:t>
       </w:r>
       <w:r>
-        <w:t xml:space="preserve">figures): approximately 8, 500 words.</w:t>
+        <w:t xml:space="preserve">figures): approximately 8,500 words.</w:t>
       </w:r>
     </w:p>
     <w:p>
@@ -5054,7 +5054,7 @@
         <w:t xml:space="preserve"> </w:t>
       </w:r>
       <w:r>
-        <w:t xml:space="preserve">sparsely populated region of the data. The 5, 000-replication bootstrap</w:t>
+        <w:t xml:space="preserve">sparsely populated region of the data. The 5,000-replication bootstrap</w:t>
       </w:r>
       <w:r>
         <w:t xml:space="preserve"> </w:t>
@@ -8548,7 +8548,7 @@
         <w:t xml:space="preserve"> </w:t>
       </w:r>
       <w:r>
-        <w:t xml:space="preserve">cluster-bootstrap confidence interval (5, 000 replications) spans [53%,</w:t>
+        <w:t xml:space="preserve">cluster-bootstrap confidence interval (5,000 replications) spans [53%,</w:t>
       </w:r>
       <w:r>
         <w:t xml:space="preserve"> </w:t>
@@ -10015,7 +10015,7 @@
         <w:t xml:space="preserve"> </w:t>
       </w:r>
       <w:r>
-        <w:t xml:space="preserve">ecosystem, 25, 000 attendees and record 6, 800 startup applications from</w:t>
+        <w:t xml:space="preserve">ecosystem, 25,000 attendees and record 6,800 startup applications from</w:t>
       </w:r>
       <w:r>
         <w:t xml:space="preserve"> </w:t>
@@ -10027,7 +10027,7 @@
         <w:t xml:space="preserve"> </w:t>
       </w:r>
       <w:r>
-        <w:t xml:space="preserve">(Enterprise Singapore, 2025), and 22, 000 delegates from 110 regions at</w:t>
+        <w:t xml:space="preserve">(Enterprise Singapore, 2025), and 22,000 delegates from 110 regions at</w:t>
       </w:r>
       <w:r>
         <w:t xml:space="preserve"> </w:t>
@@ -13253,7 +13253,7 @@
           <w:iCs/>
           <w:i/>
         </w:rPr>
-        <w:t xml:space="preserve">anniversary milestone with record 25, 000 attendees</w:t>
+        <w:t xml:space="preserve">anniversary milestone with record 25,000 attendees</w:t>
       </w:r>
       <w:r>
         <w:t xml:space="preserve"> </w:t>

</xml_diff>

<commit_message>
fix(p4): remove dated Leon (2004) citation, cite Cohen (1988) + Aguinis et al. (2005) instead
Per author decision: Leon (2004) had no full reference entry in the repo
and is outdated. The power-analysis claim is now attributed to Cohen
(1988) and Aguinis et al. (2005), both already present in all P4
reference lists and directly on-topic (statistical power for moderation
tests). Edited 3 packages + clean_en + do-file comment; regenerated
docx; updated provenance ledger and UPLOAD_INDEX (P4 gate now clear).
</commit_message>
<xml_diff>
--- a/p4/submission/apbr_package/01_manuscript_blinded.docx
+++ b/p4/submission/apbr_package/01_manuscript_blinded.docx
@@ -263,7 +263,7 @@
       </w:r>
     </w:p>
     <w:bookmarkEnd w:id="20"/>
-    <w:bookmarkStart w:id="25" w:name="Xe3d0fc0bea9a42ce7605565d0964033d7f6ee47"/>
+    <w:bookmarkStart w:id="25" w:name="introduction"/>
     <w:p>
       <w:pPr>
         <w:pStyle w:val="Heading2"/>
@@ -272,7 +272,7 @@
         <w:t xml:space="preserve">1 Introduction</w:t>
       </w:r>
     </w:p>
-    <w:bookmarkStart w:id="21" w:name="Xe5b26b80b1cffd635bf6d81ca2944b40daaf62d"/>
+    <w:bookmarkStart w:id="21" w:name="background-and-motivation"/>
     <w:p>
       <w:pPr>
         <w:pStyle w:val="Heading3"/>
@@ -328,7 +328,7 @@
         <w:t xml:space="preserve"> </w:t>
       </w:r>
       <w:r>
-        <w:t xml:space="preserve">literature (Marano et al. 2016). However, much of this literature was</w:t>
+        <w:t xml:space="preserve">literature (Marano et al. 2016). However, much of this literature was</w:t>
       </w:r>
       <w:r>
         <w:t xml:space="preserve"> </w:t>
@@ -346,7 +346,7 @@
         <w:t xml:space="preserve"> </w:t>
       </w:r>
       <w:r>
-        <w:t xml:space="preserve">those of digitally advanced economies (Peng 2003; Peng et al. 2008) and</w:t>
+        <w:t xml:space="preserve">those of digitally advanced economies (Peng 2003; Peng et al. 2008) and</w:t>
       </w:r>
       <w:r>
         <w:t xml:space="preserve"> </w:t>
@@ -478,7 +478,7 @@
         <w:t xml:space="preserve"> </w:t>
       </w:r>
       <w:r>
-        <w:t xml:space="preserve">(Bharadwaj et al. 2013; Verhoef et al. 2021). This combination creates</w:t>
+        <w:t xml:space="preserve">(Bharadwaj et al. 2013; Verhoef et al. 2021). This combination creates</w:t>
       </w:r>
       <w:r>
         <w:t xml:space="preserve"> </w:t>
@@ -521,7 +521,7 @@
         <w:t xml:space="preserve"> </w:t>
       </w:r>
       <w:r>
-        <w:t xml:space="preserve">near-universal Tier 1–2 diffusion is enabled by Singapore's nationally</w:t>
+        <w:t xml:space="preserve">near-universal Tier 1–2 diffusion is enabled by Singapore’s nationally</w:t>
       </w:r>
       <w:r>
         <w:t xml:space="preserve"> </w:t>
@@ -563,7 +563,7 @@
         <w:t xml:space="preserve"> </w:t>
       </w:r>
       <w:r>
-        <w:t xml:space="preserve">domestic orientation despite the economy's mature digital</w:t>
+        <w:t xml:space="preserve">domestic orientation despite the economy’s mature digital</w:t>
       </w:r>
       <w:r>
         <w:t xml:space="preserve"> </w:t>
@@ -683,7 +683,7 @@
         <w:t xml:space="preserve"> </w:t>
       </w:r>
       <w:r>
-        <w:t xml:space="preserve">surrounding digital ecosystem (Bharadwaj et al. 2013; Verhoef et al.</w:t>
+        <w:t xml:space="preserve">surrounding digital ecosystem (Bharadwaj et al. 2013; Verhoef et al.</w:t>
       </w:r>
       <w:r>
         <w:t xml:space="preserve"> </w:t>
@@ -693,7 +693,7 @@
       </w:r>
     </w:p>
     <w:bookmarkEnd w:id="21"/>
-    <w:bookmarkStart w:id="22" w:name="X2961a496af63dca26d6e29b654ead2e696c6fdd"/>
+    <w:bookmarkStart w:id="22" w:name="research-gap"/>
     <w:p>
       <w:pPr>
         <w:pStyle w:val="Heading3"/>
@@ -909,7 +909,7 @@
       </w:r>
     </w:p>
     <w:bookmarkEnd w:id="22"/>
-    <w:bookmarkStart w:id="23" w:name="X494b14dde48fd709c427dcfac91526fdde5ec7e"/>
+    <w:bookmarkStart w:id="23" w:name="contribution"/>
     <w:p>
       <w:pPr>
         <w:pStyle w:val="Heading3"/>
@@ -1161,7 +1161,7 @@
       </w:r>
     </w:p>
     <w:bookmarkEnd w:id="23"/>
-    <w:bookmarkStart w:id="24" w:name="Xdd618d9602139b0eee88c4277e195c55d104c48"/>
+    <w:bookmarkStart w:id="24" w:name="roadmap"/>
     <w:p>
       <w:pPr>
         <w:pStyle w:val="Heading3"/>
@@ -1204,7 +1204,7 @@
     </w:p>
     <w:bookmarkEnd w:id="24"/>
     <w:bookmarkEnd w:id="25"/>
-    <w:bookmarkStart w:id="34" w:name="X8bf20a63f0decf7b16e99d564b9958ec4fbbb23"/>
+    <w:bookmarkStart w:id="34" w:name="theory-and-hypotheses"/>
     <w:p>
       <w:pPr>
         <w:pStyle w:val="Heading2"/>
@@ -1213,7 +1213,7 @@
         <w:t xml:space="preserve">2 Theory and Hypotheses</w:t>
       </w:r>
     </w:p>
-    <w:bookmarkStart w:id="26" w:name="X9497e0c582d29cdf214e76507e8fbbcc0b6d410"/>
+    <w:bookmarkStart w:id="26" w:name="X001c1553335b0468ad48060ef103d7d22aed657"/>
     <w:p>
       <w:pPr>
         <w:pStyle w:val="Heading3"/>
@@ -1239,7 +1239,7 @@
         <w:t xml:space="preserve"> </w:t>
       </w:r>
       <w:r>
-        <w:t xml:space="preserve">performance. Hitt et al. (1997) introduced the inverted-U logic: initial</w:t>
+        <w:t xml:space="preserve">performance. Hitt et al. (1997) introduced the inverted-U logic: initial</w:t>
       </w:r>
       <w:r>
         <w:t xml:space="preserve"> </w:t>
@@ -1257,7 +1257,7 @@
         <w:t xml:space="preserve"> </w:t>
       </w:r>
       <w:r>
-        <w:t xml:space="preserve">that erode the returns to further expansion. Contractor et al. (2003)</w:t>
+        <w:t xml:space="preserve">that erode the returns to further expansion. Contractor et al. (2003)</w:t>
       </w:r>
       <w:r>
         <w:t xml:space="preserve"> </w:t>
@@ -1287,7 +1287,7 @@
         <w:t xml:space="preserve"> </w:t>
       </w:r>
       <w:r>
-        <w:t xml:space="preserve">et al. 2016). An important implication of the nonlinear I–P literature</w:t>
+        <w:t xml:space="preserve">et al. 2016). An important implication of the nonlinear I–P literature</w:t>
       </w:r>
       <w:r>
         <w:t xml:space="preserve"> </w:t>
@@ -1357,7 +1357,7 @@
       </w:r>
     </w:p>
     <w:bookmarkEnd w:id="26"/>
-    <w:bookmarkStart w:id="27" w:name="X58009fa5124754b9d12ae223bf3908d651fea58"/>
+    <w:bookmarkStart w:id="27" w:name="two-distinct-constructs-tci-and-dai"/>
     <w:p>
       <w:pPr>
         <w:pStyle w:val="Heading3"/>
@@ -1395,7 +1395,7 @@
         <w:t xml:space="preserve"> </w:t>
       </w:r>
       <w:r>
-        <w:t xml:space="preserve">participation (Verhoef et al. 2021). This study departs from that</w:t>
+        <w:t xml:space="preserve">participation (Verhoef et al. 2021). This study departs from that</w:t>
       </w:r>
       <w:r>
         <w:t xml:space="preserve"> </w:t>
@@ -1425,7 +1425,7 @@
         <w:t xml:space="preserve"> </w:t>
       </w:r>
       <w:r>
-        <w:t xml:space="preserve">al. 2013; Verhoef et al. 2021). The distinction is theoretically</w:t>
+        <w:t xml:space="preserve">al. 2013; Verhoef et al. 2021). The distinction is theoretically</w:t>
       </w:r>
       <w:r>
         <w:t xml:space="preserve"> </w:t>
@@ -1467,7 +1467,7 @@
         <w:t xml:space="preserve"> </w:t>
       </w:r>
       <w:r>
-        <w:t xml:space="preserve">transaction-enabling mechanisms (Bharadwaj et al. 2013), reflecting a</w:t>
+        <w:t xml:space="preserve">transaction-enabling mechanisms (Bharadwaj et al. 2013), reflecting a</w:t>
       </w:r>
       <w:r>
         <w:t xml:space="preserve"> </w:t>
@@ -1479,19 +1479,49 @@
         <w:t xml:space="preserve"> </w:t>
       </w:r>
       <w:r>
-        <w:t xml:space="preserve">the maturity of the surrounding digital ecosystem (Verhoef et al. 2021).</w:t>
-      </w:r>
-      <w:r>
-        <w:t xml:space="preserve"> </w:t>
-      </w:r>
-      <w:r>
-        <w:t xml:space="preserve">Equally important, the label “digital adoption” is more defensible than</w:t>
-      </w:r>
-      <w:r>
-        <w:t xml:space="preserve"> </w:t>
-      </w:r>
-      <w:r>
-        <w:t xml:space="preserve">“digital capability” in the present empirical setting because the WBES</w:t>
+        <w:t xml:space="preserve">the maturity of the surrounding digital ecosystem (Verhoef et al. 2021).</w:t>
+      </w:r>
+      <w:r>
+        <w:t xml:space="preserve"> </w:t>
+      </w:r>
+      <w:r>
+        <w:t xml:space="preserve">Equally important, the label</w:t>
+      </w:r>
+      <w:r>
+        <w:t xml:space="preserve"> </w:t>
+      </w:r>
+      <w:r>
+        <w:t xml:space="preserve">“</w:t>
+      </w:r>
+      <w:r>
+        <w:t xml:space="preserve">digital adoption</w:t>
+      </w:r>
+      <w:r>
+        <w:t xml:space="preserve">”</w:t>
+      </w:r>
+      <w:r>
+        <w:t xml:space="preserve"> </w:t>
+      </w:r>
+      <w:r>
+        <w:t xml:space="preserve">is more defensible than</w:t>
+      </w:r>
+      <w:r>
+        <w:t xml:space="preserve"> </w:t>
+      </w:r>
+      <w:r>
+        <w:t xml:space="preserve">“</w:t>
+      </w:r>
+      <w:r>
+        <w:t xml:space="preserve">digital capability</w:t>
+      </w:r>
+      <w:r>
+        <w:t xml:space="preserve">”</w:t>
+      </w:r>
+      <w:r>
+        <w:t xml:space="preserve"> </w:t>
+      </w:r>
+      <w:r>
+        <w:t xml:space="preserve">in the present empirical setting because the WBES</w:t>
       </w:r>
       <w:r>
         <w:t xml:space="preserve"> </w:t>
@@ -1509,7 +1539,7 @@
         <w:t xml:space="preserve"> </w:t>
       </w:r>
       <w:r>
-        <w:t xml:space="preserve">organizational processes. In the Verhoef et al. (2021) hierarchy,</w:t>
+        <w:t xml:space="preserve">organizational processes. In the Verhoef et al. (2021) hierarchy,</w:t>
       </w:r>
       <w:r>
         <w:t xml:space="preserve"> </w:t>
@@ -1563,7 +1593,25 @@
         <w:t xml:space="preserve"> </w:t>
       </w:r>
       <w:r>
-        <w:t xml:space="preserve">this measurement boundary, retaining a broad “digital capability” label</w:t>
+        <w:t xml:space="preserve">this measurement boundary, retaining a broad</w:t>
+      </w:r>
+      <w:r>
+        <w:t xml:space="preserve"> </w:t>
+      </w:r>
+      <w:r>
+        <w:t xml:space="preserve">“</w:t>
+      </w:r>
+      <w:r>
+        <w:t xml:space="preserve">digital capability</w:t>
+      </w:r>
+      <w:r>
+        <w:t xml:space="preserve">”</w:t>
+      </w:r>
+      <w:r>
+        <w:t xml:space="preserve"> </w:t>
+      </w:r>
+      <w:r>
+        <w:t xml:space="preserve">label</w:t>
       </w:r>
       <w:r>
         <w:t xml:space="preserve"> </w:t>
@@ -1587,7 +1635,7 @@
         <w:t xml:space="preserve"> </w:t>
       </w:r>
       <w:r>
-        <w:t xml:space="preserve">Methodologically, the two constructs satisfy the Coltman et al. (2008)</w:t>
+        <w:t xml:space="preserve">Methodologically, the two constructs satisfy the Coltman et al. (2008)</w:t>
       </w:r>
       <w:r>
         <w:t xml:space="preserve"> </w:t>
@@ -1615,7 +1663,7 @@
       </w:r>
     </w:p>
     <w:bookmarkEnd w:id="27"/>
-    <w:bookmarkStart w:id="32" w:name="Xfeb3205642325e47f2817bab2cc060c9f999b02"/>
+    <w:bookmarkStart w:id="32" w:name="hypothesis-development"/>
     <w:p>
       <w:pPr>
         <w:pStyle w:val="Heading3"/>
@@ -1624,7 +1672,7 @@
         <w:t xml:space="preserve">2.3 Hypothesis development</w:t>
       </w:r>
     </w:p>
-    <w:bookmarkStart w:id="28" w:name="X9de0e934912487c2b2355f424516474f67bf4ef"/>
+    <w:bookmarkStart w:id="28" w:name="tci-direct-effect-on-productivity"/>
     <w:p>
       <w:pPr>
         <w:pStyle w:val="Heading4"/>
@@ -1680,19 +1728,19 @@
         <w:t xml:space="preserve"> </w:t>
       </w:r>
       <w:r>
-        <w:t xml:space="preserve">efficiency, product quality, and learning routines (Avenyo et al. 2021;</w:t>
-      </w:r>
-      <w:r>
-        <w:t xml:space="preserve"> </w:t>
-      </w:r>
-      <w:r>
-        <w:t xml:space="preserve">Krammer et al. 2018). We therefore hypothesize: Hypothesis 1 (H1). In</w:t>
-      </w:r>
-      <w:r>
-        <w:t xml:space="preserve"> </w:t>
-      </w:r>
-      <w:r>
-        <w:t xml:space="preserve">Singapore's advanced-economy context, when firms invest more deeply in</w:t>
+        <w:t xml:space="preserve">efficiency, product quality, and learning routines (Avenyo et al. 2021;</w:t>
+      </w:r>
+      <w:r>
+        <w:t xml:space="preserve"> </w:t>
+      </w:r>
+      <w:r>
+        <w:t xml:space="preserve">Krammer et al. 2018). We therefore hypothesize: Hypothesis 1 (H1). In</w:t>
+      </w:r>
+      <w:r>
+        <w:t xml:space="preserve"> </w:t>
+      </w:r>
+      <w:r>
+        <w:t xml:space="preserve">Singapore’s advanced-economy context, when firms invest more deeply in</w:t>
       </w:r>
       <w:r>
         <w:t xml:space="preserve"> </w:t>
@@ -1710,7 +1758,7 @@
         <w:t xml:space="preserve"> </w:t>
       </w:r>
       <w:r>
-        <w:t xml:space="preserve">firm's operational efficiency and learning routines (Lall 1992; Cohen &amp;</w:t>
+        <w:t xml:space="preserve">firm’s operational efficiency and learning routines (Lall 1992; Cohen &amp;</w:t>
       </w:r>
       <w:r>
         <w:t xml:space="preserve"> </w:t>
@@ -1726,7 +1774,7 @@
       </w:r>
     </w:p>
     <w:bookmarkEnd w:id="28"/>
-    <w:bookmarkStart w:id="29" w:name="Xd77aef7f084e33ec0dd33a50710ed9d88a5bd5f"/>
+    <w:bookmarkStart w:id="29" w:name="tci-moderation-of-the-ip-relationship"/>
     <w:p>
       <w:pPr>
         <w:pStyle w:val="Heading4"/>
@@ -1842,7 +1890,7 @@
         <w:t xml:space="preserve"> </w:t>
       </w:r>
       <w:r>
-        <w:t xml:space="preserve">TCI-contingent I–P curvature. The present paper's H2 and H3 are</w:t>
+        <w:t xml:space="preserve">TCI-contingent I–P curvature. The present paper’s H2 and H3 are</w:t>
       </w:r>
       <w:r>
         <w:t xml:space="preserve"> </w:t>
@@ -1864,7 +1912,7 @@
       </w:r>
     </w:p>
     <w:bookmarkEnd w:id="29"/>
-    <w:bookmarkStart w:id="30" w:name="Xca797cdf899e8025c95598929e8214dfe008510"/>
+    <w:bookmarkStart w:id="30" w:name="dai-direct-effect-on-productivity"/>
     <w:p>
       <w:pPr>
         <w:pStyle w:val="Heading4"/>
@@ -1962,13 +2010,13 @@
         <w:t xml:space="preserve"> </w:t>
       </w:r>
       <w:r>
-        <w:t xml:space="preserve">those digital channels are actually used (Bharadwaj et al. 2013; Verhoef</w:t>
-      </w:r>
-      <w:r>
-        <w:t xml:space="preserve"> </w:t>
-      </w:r>
-      <w:r>
-        <w:t xml:space="preserve">et al. 2021), until a level of export intensity is reached at which</w:t>
+        <w:t xml:space="preserve">those digital channels are actually used (Bharadwaj et al. 2013; Verhoef</w:t>
+      </w:r>
+      <w:r>
+        <w:t xml:space="preserve"> </w:t>
+      </w:r>
+      <w:r>
+        <w:t xml:space="preserve">et al. 2021), until a level of export intensity is reached at which</w:t>
       </w:r>
       <w:r>
         <w:t xml:space="preserve"> </w:t>
@@ -1978,7 +2026,7 @@
       </w:r>
     </w:p>
     <w:bookmarkEnd w:id="30"/>
-    <w:bookmarkStart w:id="31" w:name="Xb90d981e4efafb918608a9cc7d37012dec59e7b"/>
+    <w:bookmarkStart w:id="31" w:name="X4a1dd7965a5d35ccd8d325197ae2dd2e833f047"/>
     <w:p>
       <w:pPr>
         <w:pStyle w:val="Heading4"/>
@@ -2250,7 +2298,7 @@
         <w:t xml:space="preserve"> </w:t>
       </w:r>
       <w:r>
-        <w:t xml:space="preserve">implies that DAI's productivity contribution grows super-linearly with</w:t>
+        <w:t xml:space="preserve">implies that DAI’s productivity contribution grows super-linearly with</w:t>
       </w:r>
       <w:r>
         <w:t xml:space="preserve"> </w:t>
@@ -2476,7 +2524,7 @@
     </w:p>
     <w:bookmarkEnd w:id="31"/>
     <w:bookmarkEnd w:id="32"/>
-    <w:bookmarkStart w:id="33" w:name="X120be97a373b91b5bab21d44e9895db7ca01e76"/>
+    <w:bookmarkStart w:id="33" w:name="conceptual-model"/>
     <w:p>
       <w:pPr>
         <w:pStyle w:val="Heading3"/>
@@ -2779,7 +2827,7 @@
     </w:p>
     <w:bookmarkEnd w:id="33"/>
     <w:bookmarkEnd w:id="34"/>
-    <w:bookmarkStart w:id="43" w:name="X167a2da0345881bf36eef0606d50b1063a572d3"/>
+    <w:bookmarkStart w:id="43" w:name="methods"/>
     <w:p>
       <w:pPr>
         <w:pStyle w:val="Heading2"/>
@@ -2788,7 +2836,7 @@
         <w:t xml:space="preserve">3 Methods</w:t>
       </w:r>
     </w:p>
-    <w:bookmarkStart w:id="35" w:name="X7539fb3dc2f98232f41138bc75cab658563f4ee"/>
+    <w:bookmarkStart w:id="35" w:name="data"/>
     <w:p>
       <w:pPr>
         <w:pStyle w:val="Heading3"/>
@@ -2886,7 +2934,7 @@
         <w:t xml:space="preserve"> </w:t>
       </w:r>
       <w:r>
-        <w:t xml:space="preserve">for the majority of Singapore's aggregate trade flows (national</w:t>
+        <w:t xml:space="preserve">for the majority of Singapore’s aggregate trade flows (national</w:t>
       </w:r>
       <w:r>
         <w:t xml:space="preserve"> </w:t>
@@ -2898,7 +2946,7 @@
         <w:t xml:space="preserve"> </w:t>
       </w:r>
       <w:r>
-        <w:t xml:space="preserve">Singapore's SME sector rather than of the national export economy;</w:t>
+        <w:t xml:space="preserve">Singapore’s SME sector rather than of the national export economy;</w:t>
       </w:r>
       <w:r>
         <w:t xml:space="preserve"> </w:t>
@@ -3094,7 +3142,7 @@
       </w:r>
     </w:p>
     <w:bookmarkEnd w:id="35"/>
-    <w:bookmarkStart w:id="40" w:name="Xbcf9f12e79107fa2c089aaf13fc6c4fb773f1c2"/>
+    <w:bookmarkStart w:id="40" w:name="variables"/>
     <w:p>
       <w:pPr>
         <w:pStyle w:val="Heading3"/>
@@ -3103,7 +3151,7 @@
         <w:t xml:space="preserve">3.2 Variables</w:t>
       </w:r>
     </w:p>
-    <w:bookmarkStart w:id="36" w:name="X7e58563e31c3ad002492190dd8d5308423faaad"/>
+    <w:bookmarkStart w:id="36" w:name="dependent-variable"/>
     <w:p>
       <w:pPr>
         <w:pStyle w:val="Heading4"/>
@@ -3169,7 +3217,7 @@
       </w:r>
     </w:p>
     <w:bookmarkEnd w:id="36"/>
-    <w:bookmarkStart w:id="37" w:name="X2cdc78afcfd9a4441a0b7b899a2b559f49a455a"/>
+    <w:bookmarkStart w:id="37" w:name="focal-independent-variable"/>
     <w:p>
       <w:pPr>
         <w:pStyle w:val="Heading4"/>
@@ -3223,7 +3271,7 @@
       </w:r>
     </w:p>
     <w:bookmarkEnd w:id="37"/>
-    <w:bookmarkStart w:id="38" w:name="X5885cfa65cddf1d15b27f59176f9dbae5a8c10a"/>
+    <w:bookmarkStart w:id="38" w:name="tci-and-dai-composites"/>
     <w:p>
       <w:pPr>
         <w:pStyle w:val="Heading4"/>
@@ -3414,7 +3462,7 @@
         <w:t xml:space="preserve"> </w:t>
       </w:r>
       <w:r>
-        <w:t xml:space="preserve">statistically weaker estimate, while the Tier-1+2 full model's adjusted</w:t>
+        <w:t xml:space="preserve">statistically weaker estimate, while the Tier-1+2 full model’s adjusted</w:t>
       </w:r>
       <w:r>
         <w:t xml:space="preserve"> </w:t>
@@ -3456,7 +3504,7 @@
         <w:t xml:space="preserve"> </w:t>
       </w:r>
       <w:r>
-        <w:t xml:space="preserve">Singapore's high-saturation institutional setting, the website indicator</w:t>
+        <w:t xml:space="preserve">Singapore’s high-saturation institutional setting, the website indicator</w:t>
       </w:r>
       <w:r>
         <w:t xml:space="preserve"> </w:t>
@@ -3505,7 +3553,7 @@
       </w:r>
     </w:p>
     <w:bookmarkEnd w:id="38"/>
-    <w:bookmarkStart w:id="39" w:name="X7f318314f3a5164dbb5d2e2bfe8bd11c34b488e"/>
+    <w:bookmarkStart w:id="39" w:name="controls"/>
     <w:p>
       <w:pPr>
         <w:pStyle w:val="Heading4"/>
@@ -3584,7 +3632,7 @@
     </w:p>
     <w:bookmarkEnd w:id="39"/>
     <w:bookmarkEnd w:id="40"/>
-    <w:bookmarkStart w:id="41" w:name="X84482d10811f20e2a246857c008316fafc15eb6"/>
+    <w:bookmarkStart w:id="41" w:name="Xf0d337b7871f1e30984357ede4c26fad3ab0772"/>
     <w:p>
       <w:pPr>
         <w:pStyle w:val="Heading3"/>
@@ -3766,7 +3814,7 @@
         <w:t xml:space="preserve"> </w:t>
       </w:r>
       <w:r>
-        <w:t xml:space="preserve">productivity. Following the recommendations of Haans et al. (2016) for</w:t>
+        <w:t xml:space="preserve">productivity. Following the recommendations of Haans et al. (2016) for</w:t>
       </w:r>
       <w:r>
         <w:t xml:space="preserve"> </w:t>
@@ -3802,7 +3850,7 @@
         <w:t xml:space="preserve"> </w:t>
       </w:r>
       <w:r>
-        <w:t xml:space="preserve">using Cohen’s f² (Aguinis et al. 2005; Cohen 1988).</w:t>
+        <w:t xml:space="preserve">using Cohen’s f² (Aguinis et al. 2005; Cohen 1988).</w:t>
       </w:r>
     </w:p>
     <w:p>
@@ -3918,7 +3966,7 @@
       </w:r>
     </w:p>
     <w:bookmarkEnd w:id="41"/>
-    <w:bookmarkStart w:id="42" w:name="X4758c326240d97a48e7d79456dba8f6cc5c46be"/>
+    <w:bookmarkStart w:id="42" w:name="X0fcf099929e626b10071b523c2c83735d5a4cd9"/>
     <w:p>
       <w:pPr>
         <w:pStyle w:val="Heading3"/>
@@ -3986,7 +4034,7 @@
         <w:t xml:space="preserve"> </w:t>
       </w:r>
       <w:r>
-        <w:t xml:space="preserve">Singapore's SME sector under the WBES sampling frame. Within this frame,</w:t>
+        <w:t xml:space="preserve">Singapore’s SME sector under the WBES sampling frame. Within this frame,</w:t>
       </w:r>
       <w:r>
         <w:t xml:space="preserve"> </w:t>
@@ -4194,13 +4242,13 @@
         <w:t xml:space="preserve"> </w:t>
       </w:r>
       <w:r>
-        <w:t xml:space="preserve">inference; (c) power requirements for interaction testing follow Leon</w:t>
-      </w:r>
-      <w:r>
-        <w:t xml:space="preserve"> </w:t>
-      </w:r>
-      <w:r>
-        <w:t xml:space="preserve">(2004). Null DAI moderation results in the exporters-only specification</w:t>
+        <w:t xml:space="preserve">inference; (c) power requirements for interaction testing follow Cohen</w:t>
+      </w:r>
+      <w:r>
+        <w:t xml:space="preserve"> </w:t>
+      </w:r>
+      <w:r>
+        <w:t xml:space="preserve">(1988) and Aguinis et al. (2005). Null DAI moderation results in the exporters-only specification</w:t>
       </w:r>
       <w:r>
         <w:t xml:space="preserve"> </w:t>
@@ -4278,13 +4326,28 @@
         <w:t xml:space="preserve"> </w:t>
       </w:r>
       <w:r>
-        <w:t xml:space="preserve">but the appropriate reading of this null is not "the inverted-U</w:t>
-      </w:r>
-      <w:r>
-        <w:t xml:space="preserve"> </w:t>
-      </w:r>
-      <w:r>
-        <w:t xml:space="preserve">fails", because the test is conditioned on dense support around the</w:t>
+        <w:t xml:space="preserve">but the appropriate reading of this null is not</w:t>
+      </w:r>
+      <w:r>
+        <w:t xml:space="preserve"> </w:t>
+      </w:r>
+      <w:r>
+        <w:t xml:space="preserve">“</w:t>
+      </w:r>
+      <w:r>
+        <w:t xml:space="preserve">the inverted-U</w:t>
+      </w:r>
+      <w:r>
+        <w:t xml:space="preserve"> </w:t>
+      </w:r>
+      <w:r>
+        <w:t xml:space="preserve">fails</w:t>
+      </w:r>
+      <w:r>
+        <w:t xml:space="preserve">”</w:t>
+      </w:r>
+      <w:r>
+        <w:t xml:space="preserve">, because the test is conditioned on dense support around the</w:t>
       </w:r>
       <w:r>
         <w:t xml:space="preserve"> </w:t>
@@ -4611,7 +4674,7 @@
     </w:p>
     <w:bookmarkEnd w:id="42"/>
     <w:bookmarkEnd w:id="43"/>
-    <w:bookmarkStart w:id="49" w:name="X121719332867ee227f0a04b486098cee978c6e6"/>
+    <w:bookmarkStart w:id="49" w:name="results"/>
     <w:p>
       <w:pPr>
         <w:pStyle w:val="Heading2"/>
@@ -4620,7 +4683,7 @@
         <w:t xml:space="preserve">4 Results</w:t>
       </w:r>
     </w:p>
-    <w:bookmarkStart w:id="44" w:name="Xcfcbc1028680fbd618b9b585dd17cf608861803"/>
+    <w:bookmarkStart w:id="44" w:name="descriptive-statistics"/>
     <w:p>
       <w:pPr>
         <w:pStyle w:val="Heading3"/>
@@ -5004,7 +5067,7 @@
       </w:r>
     </w:p>
     <w:bookmarkEnd w:id="44"/>
-    <w:bookmarkStart w:id="45" w:name="Xe86cbbe4620ce5d84f78b7737e30408048ed6af"/>
+    <w:bookmarkStart w:id="45" w:name="X2451d3f7ca997a4cc37eff64b1b544b095ebde1"/>
     <w:p>
       <w:pPr>
         <w:pStyle w:val="Heading3"/>
@@ -5084,7 +5147,7 @@
         <w:t xml:space="preserve"> </w:t>
       </w:r>
       <w:r>
-        <w:t xml:space="preserve">= .303). This null is itself an informative positive result: Singapore's</w:t>
+        <w:t xml:space="preserve">= .303). This null is itself an informative positive result: Singapore’s</w:t>
       </w:r>
       <w:r>
         <w:t xml:space="preserve"> </w:t>
@@ -5156,19 +5219,49 @@
         <w:t xml:space="preserve"> </w:t>
       </w:r>
       <w:r>
-        <w:t xml:space="preserve">statistically underpowered to distinguish "no inverted-U" from</w:t>
-      </w:r>
-      <w:r>
-        <w:t xml:space="preserve"> </w:t>
-      </w:r>
-      <w:r>
-        <w:t xml:space="preserve">"inverted-U whose right-side decline has been pushed into the unobserved</w:t>
-      </w:r>
-      <w:r>
-        <w:t xml:space="preserve"> </w:t>
-      </w:r>
-      <w:r>
-        <w:t xml:space="preserve">upper tail." Under both hypotheses the data are consistent with a</w:t>
+        <w:t xml:space="preserve">statistically underpowered to distinguish</w:t>
+      </w:r>
+      <w:r>
+        <w:t xml:space="preserve"> </w:t>
+      </w:r>
+      <w:r>
+        <w:t xml:space="preserve">“</w:t>
+      </w:r>
+      <w:r>
+        <w:t xml:space="preserve">no inverted-U</w:t>
+      </w:r>
+      <w:r>
+        <w:t xml:space="preserve">”</w:t>
+      </w:r>
+      <w:r>
+        <w:t xml:space="preserve"> </w:t>
+      </w:r>
+      <w:r>
+        <w:t xml:space="preserve">from</w:t>
+      </w:r>
+      <w:r>
+        <w:t xml:space="preserve"> </w:t>
+      </w:r>
+      <w:r>
+        <w:t xml:space="preserve">“</w:t>
+      </w:r>
+      <w:r>
+        <w:t xml:space="preserve">inverted-U whose right-side decline has been pushed into the unobserved</w:t>
+      </w:r>
+      <w:r>
+        <w:t xml:space="preserve"> </w:t>
+      </w:r>
+      <w:r>
+        <w:t xml:space="preserve">upper tail.</w:t>
+      </w:r>
+      <w:r>
+        <w:t xml:space="preserve">”</w:t>
+      </w:r>
+      <w:r>
+        <w:t xml:space="preserve"> </w:t>
+      </w:r>
+      <w:r>
+        <w:t xml:space="preserve">Under both hypotheses the data are consistent with a</w:t>
       </w:r>
       <w:r>
         <w:t xml:space="preserve"> </w:t>
@@ -5257,7 +5350,7 @@
       </w:r>
     </w:p>
     <w:bookmarkEnd w:id="45"/>
-    <w:bookmarkStart w:id="46" w:name="Xbd081e7d38ad07e1e46d233e5fbc3c3c47a4f64"/>
+    <w:bookmarkStart w:id="46" w:name="tci-results"/>
     <w:p>
       <w:pPr>
         <w:pStyle w:val="Heading3"/>
@@ -5389,7 +5482,7 @@
       </w:r>
     </w:p>
     <w:bookmarkEnd w:id="46"/>
-    <w:bookmarkStart w:id="47" w:name="X0bc604979a3b7f5f87ce430a2a9c0e71ddd76f9"/>
+    <w:bookmarkStart w:id="47" w:name="dai-results"/>
     <w:p>
       <w:pPr>
         <w:pStyle w:val="Heading3"/>
@@ -5469,19 +5562,19 @@
     <w:tbl>
       <w:tblPr>
         <w:tblStyle w:val="Table"/>
-        <w:tblW w:type="auto" w:w="0"/>
+        <w:tblW w:type="pct" w:w="5000"/>
         <w:tblLook w:firstRow="1" w:lastRow="0" w:firstColumn="0" w:lastColumn="0" w:noHBand="0" w:noVBand="0" w:val="0020"/>
         <w:jc w:val="start"/>
       </w:tblPr>
       <w:tblGrid>
-        <w:gridCol w:w="990"/>
-        <w:gridCol w:w="990"/>
-        <w:gridCol w:w="990"/>
-        <w:gridCol w:w="990"/>
-        <w:gridCol w:w="990"/>
-        <w:gridCol w:w="990"/>
-        <w:gridCol w:w="990"/>
-        <w:gridCol w:w="990"/>
+        <w:gridCol w:w="1047"/>
+        <w:gridCol w:w="981"/>
+        <w:gridCol w:w="981"/>
+        <w:gridCol w:w="981"/>
+        <w:gridCol w:w="981"/>
+        <w:gridCol w:w="981"/>
+        <w:gridCol w:w="981"/>
+        <w:gridCol w:w="981"/>
       </w:tblGrid>
       <w:tr>
         <w:trPr>
@@ -7638,16 +7731,16 @@
     <w:tbl>
       <w:tblPr>
         <w:tblStyle w:val="Table"/>
-        <w:tblW w:type="auto" w:w="0"/>
+        <w:tblW w:type="pct" w:w="5000"/>
         <w:tblLook w:firstRow="1" w:lastRow="0" w:firstColumn="0" w:lastColumn="0" w:noHBand="0" w:noVBand="0" w:val="0020"/>
         <w:jc w:val="start"/>
       </w:tblPr>
       <w:tblGrid>
-        <w:gridCol w:w="1584"/>
-        <w:gridCol w:w="1584"/>
-        <w:gridCol w:w="1584"/>
-        <w:gridCol w:w="1584"/>
-        <w:gridCol w:w="1584"/>
+        <w:gridCol w:w="2099"/>
+        <w:gridCol w:w="2290"/>
+        <w:gridCol w:w="667"/>
+        <w:gridCol w:w="954"/>
+        <w:gridCol w:w="1908"/>
       </w:tblGrid>
       <w:tr>
         <w:trPr>
@@ -8588,7 +8681,7 @@
       </w:r>
     </w:p>
     <w:bookmarkEnd w:id="47"/>
-    <w:bookmarkStart w:id="48" w:name="Xc8e997e14555d7ba8da5c1d596c5311617447cd"/>
+    <w:bookmarkStart w:id="48" w:name="robustness-checks"/>
     <w:p>
       <w:pPr>
         <w:pStyle w:val="Heading3"/>
@@ -8770,7 +8863,7 @@
         <w:t xml:space="preserve"> </w:t>
       </w:r>
       <w:r>
-        <w:t xml:space="preserve">rather than absorbed into a broader capability construct. Cohen's f² for</w:t>
+        <w:t xml:space="preserve">rather than absorbed into a broader capability construct. Cohen’s f² for</w:t>
       </w:r>
       <w:r>
         <w:t xml:space="preserve"> </w:t>
@@ -8782,13 +8875,13 @@
         <w:t xml:space="preserve"> </w:t>
       </w:r>
       <w:r>
-        <w:t xml:space="preserve">the small-to-medium range; Cohen's f² for the DAI moderation block</w:t>
-      </w:r>
-      <w:r>
-        <w:t xml:space="preserve"> </w:t>
-      </w:r>
-      <w:r>
-        <w:t xml:space="preserve">(comparing M7 with M8) is approximately 0.018, below Cohen's (1988)</w:t>
+        <w:t xml:space="preserve">the small-to-medium range; Cohen’s f² for the DAI moderation block</w:t>
+      </w:r>
+      <w:r>
+        <w:t xml:space="preserve"> </w:t>
+      </w:r>
+      <w:r>
+        <w:t xml:space="preserve">(comparing M7 with M8) is approximately 0.018, below Cohen’s (1988)</w:t>
       </w:r>
       <w:r>
         <w:t xml:space="preserve"> </w:t>
@@ -9010,17 +9103,17 @@
     <w:tbl>
       <w:tblPr>
         <w:tblStyle w:val="Table"/>
-        <w:tblW w:type="auto" w:w="0"/>
+        <w:tblW w:type="pct" w:w="5000"/>
         <w:tblLook w:firstRow="1" w:lastRow="0" w:firstColumn="0" w:lastColumn="0" w:noHBand="0" w:noVBand="0" w:val="0020"/>
         <w:jc w:val="start"/>
       </w:tblPr>
       <w:tblGrid>
-        <w:gridCol w:w="1320"/>
-        <w:gridCol w:w="1320"/>
-        <w:gridCol w:w="1320"/>
-        <w:gridCol w:w="1320"/>
-        <w:gridCol w:w="1320"/>
-        <w:gridCol w:w="1320"/>
+        <w:gridCol w:w="3095"/>
+        <w:gridCol w:w="455"/>
+        <w:gridCol w:w="1183"/>
+        <w:gridCol w:w="1183"/>
+        <w:gridCol w:w="1183"/>
+        <w:gridCol w:w="819"/>
       </w:tblGrid>
       <w:tr>
         <w:trPr>
@@ -9686,7 +9779,7 @@
     </w:p>
     <w:bookmarkEnd w:id="48"/>
     <w:bookmarkEnd w:id="49"/>
-    <w:bookmarkStart w:id="52" w:name="X735612638e4e736e4693e459c258977262c0dfc"/>
+    <w:bookmarkStart w:id="52" w:name="discussion"/>
     <w:p>
       <w:pPr>
         <w:pStyle w:val="Heading2"/>
@@ -9695,7 +9788,7 @@
         <w:t xml:space="preserve">5 Discussion</w:t>
       </w:r>
     </w:p>
-    <w:bookmarkStart w:id="50" w:name="X027b31c2d090a00917aa7291770680fd40b64cd"/>
+    <w:bookmarkStart w:id="50" w:name="theoretical-implications"/>
     <w:p>
       <w:pPr>
         <w:pStyle w:val="Heading3"/>
@@ -10009,7 +10102,7 @@
         <w:t xml:space="preserve"> </w:t>
       </w:r>
       <w:r>
-        <w:t xml:space="preserve">interfaces and transaction systems. The scale of Singapore's innovation</w:t>
+        <w:t xml:space="preserve">interfaces and transaction systems. The scale of Singapore’s innovation</w:t>
       </w:r>
       <w:r>
         <w:t xml:space="preserve"> </w:t>
@@ -10039,7 +10132,7 @@
         <w:t xml:space="preserve"> </w:t>
       </w:r>
       <w:r>
-        <w:t xml:space="preserve">Development Authority (IMDA, 2025), confirming that Singapore's</w:t>
+        <w:t xml:space="preserve">Development Authority (IMDA, 2025), confirming that Singapore’s</w:t>
       </w:r>
       <w:r>
         <w:t xml:space="preserve"> </w:t>
@@ -10163,7 +10256,7 @@
         <w:t xml:space="preserve"> </w:t>
       </w:r>
       <w:r>
-        <w:t xml:space="preserve">on FSTS² × DAI (β=+3.119, p=.005) implies that DAI's productivity</w:t>
+        <w:t xml:space="preserve">on FSTS² × DAI (β=+3.119, p=.005) implies that DAI’s productivity</w:t>
       </w:r>
       <w:r>
         <w:t xml:space="preserve"> </w:t>
@@ -10401,7 +10494,7 @@
         <w:t xml:space="preserve"> </w:t>
       </w:r>
       <w:r>
-        <w:t xml:space="preserve">the DAI construct used here. This paper's DAI combines website presence</w:t>
+        <w:t xml:space="preserve">the DAI construct used here. This paper’s DAI combines website presence</w:t>
       </w:r>
       <w:r>
         <w:t xml:space="preserve"> </w:t>
@@ -10743,7 +10836,7 @@
       </w:r>
     </w:p>
     <w:bookmarkEnd w:id="50"/>
-    <w:bookmarkStart w:id="51" w:name="Xa4e692b259d9b803bab54ad026a7e8d888a5d2c"/>
+    <w:bookmarkStart w:id="51" w:name="managerial-implications"/>
     <w:p>
       <w:pPr>
         <w:pStyle w:val="Heading3"/>
@@ -10948,7 +11041,7 @@
     </w:p>
     <w:bookmarkEnd w:id="51"/>
     <w:bookmarkEnd w:id="52"/>
-    <w:bookmarkStart w:id="53" w:name="X6b297cc947e0db5526be369b1f0f4ddc67b2415"/>
+    <w:bookmarkStart w:id="53" w:name="conclusion"/>
     <w:p>
       <w:pPr>
         <w:pStyle w:val="Heading2"/>
@@ -11164,7 +11257,7 @@
       </w:r>
     </w:p>
     <w:bookmarkEnd w:id="53"/>
-    <w:bookmarkStart w:id="54" w:name="X422fdd10c3908fe492ea939b97371c73422dbba"/>
+    <w:bookmarkStart w:id="54" w:name="limitations-and-future-research"/>
     <w:p>
       <w:pPr>
         <w:pStyle w:val="Heading2"/>
@@ -11490,14 +11583,12 @@
         <w:t xml:space="preserve"> </w:t>
       </w:r>
       <w:hyperlink r:id="rId55">
-        <w:hyperlink r:id="rId55">
-          <w:r>
-            <w:rPr>
-              <w:rStyle w:val="Hyperlink"/>
-            </w:rPr>
-            <w:t xml:space="preserve">www.enterprisesurveys.org</w:t>
-          </w:r>
-        </w:hyperlink>
+        <w:r>
+          <w:rPr>
+            <w:rStyle w:val="Hyperlink"/>
+          </w:rPr>
+          <w:t xml:space="preserve">www.enterprisesurveys.org</w:t>
+        </w:r>
       </w:hyperlink>
       <w:r>
         <w:t xml:space="preserve">. Analysis</w:t>
@@ -12185,7 +12276,7 @@
         <w:t xml:space="preserve"> </w:t>
       </w:r>
       <w:r>
-        <w:t xml:space="preserve">or multi-stage theory of internationalization vs. the transaction cost</w:t>
+        <w:t xml:space="preserve">or multi-stage theory of internationalization vs. the transaction cost</w:t>
       </w:r>
       <w:r>
         <w:t xml:space="preserve"> </w:t>

</xml_diff>